<commit_message>
Tighten citation support in the manuscript and mark the fixes in green
Applies the citation review: the predicted-methane source is removed from the
measured-methane ranges, the genetic-correlation claim now has genetic
sources, overstated PAC validation wording is softened, and several
citations are moved to the papers that actually support each sentence. The
EndNote export shows these edits in green so the author and supervisors can
check them.

Co-Authored-By: Claude Opus 5.5 <noreply@anthropic.com>
Claude-Session: https://claude.ai/code/session_011pcAjTufrABAdJ2Ewj7SR3
</commit_message>
<xml_diff>
--- a/manuscript/revised/Methane_manuscript_draft7_EndNote.docx
+++ b/manuscript/revised/Methane_manuscript_draft7_EndNote.docx
@@ -248,7 +248,37 @@
           <w:b w:val="0"/>
           <w:i w:val="0"/>
         </w:rPr>
-        <w:t xml:space="preserve">Genetic selection for low-emitting animals has emerged as one of the most promising of these methane mitigation strategies, with moderate heritability reported for methane production {Ryan, 2025 #146} and the cumulative, long term nature of genetic gain {Rowe, 2022 #147}. The recent development of high-throughput phenotyping technologies, most notably portable accumulation chambers (PACs), has enabled routine, large-scale collection of individual-animal methane phenotypes across both research and commercial flocks {O'Connor, 2021 #23; Jonker, 2018 #99}. </w:t>
+        <w:t xml:space="preserve">Genetic selection for low-emitting animals has emerged as one of the most promising of these methane mitigation strategies, with moderate heritability reported for methane production {Ryan, 2025 #146} and the cumulative, long term nature of genetic gain </w:t>
+      </w:r>
+      <w:r>
+        <w:rPr>
+          <w:b w:val="0"/>
+          <w:i w:val="0"/>
+          <w:highlight w:val="green"/>
+        </w:rPr>
+        <w:t>{Rowe, 2022 #147; Kamalanathan, 2023}</w:t>
+      </w:r>
+      <w:r>
+        <w:rPr>
+          <w:b w:val="0"/>
+          <w:i w:val="0"/>
+        </w:rPr>
+        <w:t xml:space="preserve">. The recent development of high-throughput phenotyping technologies, most notably portable accumulation chambers (PACs), has enabled routine, large-scale collection of individual-animal methane phenotypes across both research and commercial flocks </w:t>
+      </w:r>
+      <w:r>
+        <w:rPr>
+          <w:b w:val="0"/>
+          <w:i w:val="0"/>
+          <w:highlight w:val="green"/>
+        </w:rPr>
+        <w:t>{Jonker, 2018 #99; Wahinya, 2022}</w:t>
+      </w:r>
+      <w:r>
+        <w:rPr>
+          <w:b w:val="0"/>
+          <w:i w:val="0"/>
+        </w:rPr>
+        <w:t xml:space="preserve">. </w:t>
       </w:r>
       <w:r>
         <w:rPr>
@@ -256,14 +286,61 @@
           <w:i w:val="0"/>
           <w:highlight w:val="yellow"/>
         </w:rPr>
-        <w:t>Portable accumulation chambers are portable and low-cost, allowing groups of animals to be measured in about an hour under field conditions {Goopy, 2016; Robinson, 2015}. Methane measurements from PACs have been shown to be heritable (0.13–0.20 in grazing sheep) {Jonker, 2018 #99; Goopy, 2016; Wahinya, 2022} and genetically correlated with respiration chamber (RC) methane (rg = 0.62–1.00) {Jonker, 2018 #99; Robinson, 2020}. PACs also record carbon dioxide (CO₂), which is correlated with feed intake and so offers a proxy for intake in grazing animals, where it cannot be measured directly {Robinson, 2016; Robinson, 2020}. Although PACs provide a short spot measurement taken after feed withdrawal, and so show lower repeatability than RCs {O'Connor, 2021 #23; Jonker, 2018 #99; Robinson, 2015}, they have been consistently validated for ranking animals on methane output {Levrault, 2023; O'Connor, 2024}. PAC recordings are highly precise (repeatability &gt; 0.99 against known methane releases) {Levrault, 2023}, and sire rankings are maintained across grazing and controlled environments {Wahinya, 2022}. As genetic selection depends on ranking animals correctly rather than on absolute emission values, PACs are well suited to large-scale genetic evaluation of methane in sheep {Jonker, 2018 #99; Wahinya, 2022}.</w:t>
-      </w:r>
-      <w:r>
-        <w:rPr>
-          <w:b w:val="0"/>
-          <w:i w:val="0"/>
-        </w:rPr>
-        <w:t xml:space="preserve"> Methane production has also been shown to have strong (positive) genetic and phenotypic correlations with key production traits such as body weight, growth, and feed intake {Bird-Gardiner, 2017 #65; Crowley, 2024 #70}. As a result, direct selection for reduced absolute methane emissions risks inadvertently constraining animal performance.</w:t>
+        <w:t xml:space="preserve">Portable accumulation chambers are portable and low-cost, allowing groups of animals to be measured in about an hour under field conditions {Goopy, 2016; Robinson, 2015}. Methane measurements from PACs have been shown to be heritable (0.13–0.20 in grazing sheep) {Jonker, 2018 #99; Goopy, 2016; Wahinya, 2022} and genetically correlated with respiration chamber (RC) methane (rg = 0.62–1.00) {Jonker, 2018 #99; Robinson, 2020}. PACs also record carbon dioxide (CO₂), which is correlated with feed intake and so offers a proxy for intake in grazing animals, where it cannot be measured directly {Robinson, 2016; Robinson, 2020}. Although PACs provide a short spot measurement taken after feed withdrawal, and so show lower repeatability than RCs </w:t>
+      </w:r>
+      <w:r>
+        <w:rPr>
+          <w:b w:val="0"/>
+          <w:i w:val="0"/>
+          <w:highlight w:val="green"/>
+        </w:rPr>
+        <w:t>{Jonker, 2018 #99; Robinson, 2015}</w:t>
+      </w:r>
+      <w:r>
+        <w:rPr>
+          <w:b w:val="0"/>
+          <w:i w:val="0"/>
+          <w:highlight w:val="yellow"/>
+        </w:rPr>
+        <w:t xml:space="preserve">, they have been </w:t>
+      </w:r>
+      <w:r>
+        <w:rPr>
+          <w:b w:val="0"/>
+          <w:i w:val="0"/>
+          <w:highlight w:val="green"/>
+        </w:rPr>
+        <w:t>shown to rank animals on methane output</w:t>
+      </w:r>
+      <w:r>
+        <w:rPr>
+          <w:b w:val="0"/>
+          <w:i w:val="0"/>
+          <w:highlight w:val="yellow"/>
+        </w:rPr>
+        <w:t xml:space="preserve"> {Levrault, 2023; O'Connor, 2024}. PAC recordings are highly precise (repeatability &gt; 0.99 against known methane releases) {Levrault, 2023}, and sire rankings are maintained across grazing and controlled environments {Wahinya, 2022}. As genetic selection depends on ranking animals correctly rather than on absolute emission values, PACs are well suited to large-scale genetic evaluation of methane in sheep {Jonker, 2018 #99; Wahinya, 2022}.</w:t>
+      </w:r>
+      <w:r>
+        <w:rPr>
+          <w:b w:val="0"/>
+          <w:i w:val="0"/>
+        </w:rPr>
+        <w:t xml:space="preserve"> Methane production has also been shown to have strong (positive) genetic and phenotypic correlations with key production traits such as body weight, growth, and feed intake </w:t>
+      </w:r>
+      <w:r>
+        <w:rPr>
+          <w:b w:val="0"/>
+          <w:i w:val="0"/>
+          <w:highlight w:val="green"/>
+        </w:rPr>
+        <w:t>{Ryan, 2025 #146; Bird-Gardiner, 2017 #65; Crowley, 2024 #70; Crowley, 2026 #169}</w:t>
+      </w:r>
+      <w:r>
+        <w:rPr>
+          <w:b w:val="0"/>
+          <w:i w:val="0"/>
+        </w:rPr>
+        <w:t>. As a result, direct selection for reduced absolute methane emissions risks inadvertently constraining animal performance.</w:t>
       </w:r>
     </w:p>
     <w:p>
@@ -290,7 +367,22 @@
           <w:b w:val="0"/>
           <w:i w:val="0"/>
         </w:rPr>
-        <w:t>, enables emissions to be quantified in a way that is less directly tied to an animal's body size and growth. Traits such as methane intensity, methane yield, and residual methane express emissions relative to an animal's metabolic demands or level of performance {Crowley, 2024 #70; Smith, 2021 #79}. These traits can identify animals that emit less methane than expected for their level of productivity and have therefore been proposed as a potential means of mitigating unfavourable genetic correlations between methane production and key production traits {Manzanilla-Pech, 2022 #148}. Phenotypic analyses have shown that these alternative methane metrics can differ substantially in their relationships with production traits and with each other {Kelly, 2026 #187}. Both ratio and residual methane traits present known theoretical limitations, and, as noted by Lassen and Difford {Lassen, 2020}, the genetic parameters of these alternative definitions remain underexplored. The present study therefore estimates genetic parameters for alternative methane traits in sheep, including their relationships with each other and with key production traits, and explores how they respond to selection.</w:t>
+        <w:t xml:space="preserve">, enables emissions to be quantified in a way that is less directly tied to an animal's body size and growth. Traits such as methane intensity, methane yield, and residual methane express emissions relative to an animal's metabolic demands or level of performance {Crowley, 2024 #70; Smith, 2021 #79}. These traits can identify animals that emit less methane than expected for their level of productivity and have therefore been proposed as a potential means of mitigating unfavourable genetic correlations between methane production and key production traits </w:t>
+      </w:r>
+      <w:r>
+        <w:rPr>
+          <w:b w:val="0"/>
+          <w:i w:val="0"/>
+          <w:highlight w:val="green"/>
+        </w:rPr>
+        <w:t>{Manzanilla-Pech, 2022 #148; Manzanilla-Pech, 2021}</w:t>
+      </w:r>
+      <w:r>
+        <w:rPr>
+          <w:b w:val="0"/>
+          <w:i w:val="0"/>
+        </w:rPr>
+        <w:t>. Phenotypic analyses have shown that these alternative methane metrics can differ substantially in their relationships with production traits and with each other {Kelly, 2026 #187}. Both ratio and residual methane traits present known theoretical limitations, and, as noted by Lassen and Difford {Lassen, 2020}, the genetic parameters of these alternative definitions remain underexplored. The present study therefore estimates genetic parameters for alternative methane traits in sheep, including their relationships with each other and with key production traits, and explores how they respond to selection.</w:t>
       </w:r>
     </w:p>
     <w:p>
@@ -1345,7 +1437,23 @@
           <w:i w:val="0"/>
           <w:highlight w:val="yellow"/>
         </w:rPr>
-        <w:t>The genetic correlations reported below (Tables 3–5) are from a single homogeneous residual variance for every trait. As a genetic correlation is the ratio of the genetic covariance to the product of the genetic standard deviations, differences in scale between groups of animals change the covariance and the standard deviations in the same proportion, so the genetic correlation itself is expected to be largely unaffected by residual heterogeneity {Meuwissen, 1996}. This was tested empirically by refitting the CH₄–CH₄/MBW bivariate model separately in young and mature animals; the genetic correlation was unchanged across the full data and both age groups (rg = 0.85 in each case).</w:t>
+        <w:t xml:space="preserve">The genetic correlations reported below (Tables 3–5) are from a single homogeneous residual variance for every trait. As a genetic correlation is the ratio of the genetic covariance to the product of the genetic standard deviations, differences in scale between groups of animals change the covariance and the standard deviations in the same proportion, so the genetic correlation itself is expected, </w:t>
+      </w:r>
+      <w:r>
+        <w:rPr>
+          <w:b w:val="0"/>
+          <w:i w:val="0"/>
+          <w:highlight w:val="green"/>
+        </w:rPr>
+        <w:t>under a multiplicative scaling model,</w:t>
+      </w:r>
+      <w:r>
+        <w:rPr>
+          <w:b w:val="0"/>
+          <w:i w:val="0"/>
+          <w:highlight w:val="yellow"/>
+        </w:rPr>
+        <w:t xml:space="preserve"> to be largely unaffected by residual heterogeneity {Meuwissen, 1996}. This was tested empirically by refitting the CH₄–CH₄/MBW bivariate model separately in young and mature animals; the genetic correlation was unchanged across the full data and both age groups (rg = 0.85 in each case).</w:t>
       </w:r>
       <w:r>
         <w:rPr>
@@ -1594,7 +1702,22 @@
           <w:b w:val="0"/>
           <w:i w:val="0"/>
         </w:rPr>
-        <w:t>Each methane trait was expressed as a breeding goal with weights on CH₄, MBW and CO₂. Absolute methane placed a weight on CH₄ only. The residual traits deducted MBW and CO₂ from CH₄ using either the genetic regression coefficients (genetic residual; 0.833 per kg⁰·⁷⁵ and −6.09×10⁻⁵ per g day⁻¹) or the phenotypic regression coefficients (phenotypic residual, corresponding to RMTMBW+CO₂; 0.423 per kg⁰·⁷⁵ and 0.00371 per g day⁻¹). The ratio traits CH₄/MBW and CH₄ ratio (CH₄/(CH₄+CO₂)) were linearised around the trait means using a first-order Taylor series approximation {Lin, 1980 #163; Gunsett, 1984; Lin, 2013}, which is equivalent to deducting 0.810 × MBW and 0.0151 × CO₂ from CH₄, respectively. Linearised at the means, CH₄ ratio and CH₄/CO₂ give the same goal direction (0.0151 = mean CH₄ / mean CO₂), so the results for CH₄ ratio apply equally to CH₄/CO₂.</w:t>
+        <w:t xml:space="preserve">Each methane trait was expressed as a breeding goal with weights on CH₄, MBW and CO₂. Absolute methane placed a weight on CH₄ only. The residual traits deducted MBW and CO₂ from CH₄ using either the genetic regression coefficients (genetic residual; 0.833 per kg⁰·⁷⁵ and −6.09×10⁻⁵ per g day⁻¹) or the phenotypic regression coefficients (phenotypic residual, corresponding to RMTMBW+CO₂; 0.423 per kg⁰·⁷⁵ and 0.00371 per g day⁻¹). The ratio traits CH₄/MBW and CH₄ ratio (CH₄/(CH₄+CO₂)) were linearised around the trait means using a first-order Taylor series approximation </w:t>
+      </w:r>
+      <w:r>
+        <w:rPr>
+          <w:b w:val="0"/>
+          <w:i w:val="0"/>
+          <w:highlight w:val="green"/>
+        </w:rPr>
+        <w:t>{Gunsett, 1984; Lin, 2013}</w:t>
+      </w:r>
+      <w:r>
+        <w:rPr>
+          <w:b w:val="0"/>
+          <w:i w:val="0"/>
+        </w:rPr>
+        <w:t>, which is equivalent to deducting 0.810 × MBW and 0.0151 × CO₂ from CH₄, respectively. Linearised at the means, CH₄ ratio and CH₄/CO₂ give the same goal direction (0.0151 = mean CH₄ / mean CO₂), so the results for CH₄ ratio apply equally to CH₄/CO₂.</w:t>
       </w:r>
     </w:p>
     <w:p>
@@ -8292,7 +8415,22 @@
           <w:b w:val="0"/>
           <w:i w:val="0"/>
         </w:rPr>
-        <w:t xml:space="preserve">Heritability estimates across the nine methane trait definitions ranged from 0.12 to 0.46, indicating that methane production carries meaningful additive genetic variation whichever way it is expressed. These estimates lie within the range reported for methane traits in sheep {Jonker, 2018 #99; Pinares-Patiño, 2013 #67}, beef {Ryan, 2025 #146; Crowley, 2026 #169} and dairy cattle {van Breukelen, 2023 #171; de Haas, 2011; Kamalanathan, 2023}, and are comparable in magnitude to traits already used in livestock breeding programmes, such as somatic cell count {Shook, 1994 #172}, which has delivered sustained genetic gain in dairy cattle once incorporated into a breeding objective {García-Ruiz, 2016 #173}. </w:t>
+        <w:t xml:space="preserve">Heritability estimates across the nine methane trait definitions ranged from 0.12 to 0.46, indicating that methane production carries meaningful additive genetic variation whichever way it is expressed. These estimates lie within the range reported for methane traits in sheep {Jonker, 2018 #99; Pinares-Patiño, 2013 #67}, beef {Ryan, 2025 #146; Crowley, 2026 #169} and dairy cattle </w:t>
+      </w:r>
+      <w:r>
+        <w:rPr>
+          <w:b w:val="0"/>
+          <w:i w:val="0"/>
+          <w:highlight w:val="green"/>
+        </w:rPr>
+        <w:t>{van Breukelen, 2023 #171; Kamalanathan, 2023}</w:t>
+      </w:r>
+      <w:r>
+        <w:rPr>
+          <w:b w:val="0"/>
+          <w:i w:val="0"/>
+        </w:rPr>
+        <w:t xml:space="preserve">, and are comparable in magnitude to traits already used in livestock breeding programmes, such as somatic cell count {Shook, 1994 #172}, which has delivered sustained genetic gain in dairy cattle once incorporated into a breeding objective {García-Ruiz, 2016 #173}. </w:t>
       </w:r>
       <w:r>
         <w:rPr>
@@ -8300,7 +8438,23 @@
           <w:i w:val="0"/>
           <w:highlight w:val="yellow"/>
         </w:rPr>
-        <w:t>Feed intake is the main determinant of an animal's daily methane output {Belanche, 2023; Hristov, 2018}. Where intake is recorded, methane is therefore commonly expressed per unit of intake (methane yield) or residualised on intake {Manzanilla-Pech, 2021; Richardson, 2021}. In grazing sheep, however, feed intake is rarely measured at scale, and scaling or residualising methane against body size, growth or production traits serves as a practical proxy for that missing feed-intake information {Crowley, 2024 #70; Smith, 2021 #79}. The adjustment traits used here are also biologically relevant in their own right. Maintenance energy requirements, and hence much of an animal's feed intake, scale with metabolic body weight, so MBW captures the size-driven component of intake. Average daily gain and muscle mass describe the rate and product of growth, so methane expressed relative to them approximates emissions per unit of output. Rumen volume reflects fermentative capacity and retention time {Goopy, 2014}. Carbon dioxide output reflects total metabolic activity and is closely related to feed intake in PAC-measured sheep {Robinson, 2016; Robinson, 2020}, so CH₄ ratio and RMTMBW+CO₂ approximate methane relative to intake. The results presented here show both the value and the limits of that approach.</w:t>
+        <w:t xml:space="preserve">Feed intake is the main determinant of an animal's daily methane output {Belanche, 2023; Hristov, 2018}. Where intake is recorded, methane is therefore commonly expressed per unit of intake (methane yield) or residualised on intake {Manzanilla-Pech, 2021; Richardson, 2021}. In grazing sheep, however, feed intake is rarely measured at scale, and scaling or residualising methane against body size, growth or production traits serves as a practical proxy for that missing feed-intake information </w:t>
+      </w:r>
+      <w:r>
+        <w:rPr>
+          <w:b w:val="0"/>
+          <w:i w:val="0"/>
+          <w:highlight w:val="green"/>
+        </w:rPr>
+        <w:t>{Crowley, 2024 #70; Smith, 2021 #79; Robinson, 2016; Robinson, 2020}</w:t>
+      </w:r>
+      <w:r>
+        <w:rPr>
+          <w:b w:val="0"/>
+          <w:i w:val="0"/>
+          <w:highlight w:val="yellow"/>
+        </w:rPr>
+        <w:t>. The adjustment traits used here are also biologically relevant in their own right. Maintenance energy requirements, and hence much of an animal's feed intake, scale with metabolic body weight, so MBW captures the size-driven component of intake. Average daily gain and muscle mass describe the rate and product of growth, so methane expressed relative to them approximates emissions per unit of output. Rumen volume reflects fermentative capacity and retention time {Goopy, 2014}. Carbon dioxide output reflects total metabolic activity and is closely related to feed intake in PAC-measured sheep {Robinson, 2016; Robinson, 2020}, so CH₄ ratio and RMTMBW+CO₂ approximate methane relative to intake. The results presented here show both the value and the limits of that approach.</w:t>
       </w:r>
     </w:p>
     <w:p>
@@ -8313,7 +8467,39 @@
           <w:i w:val="0"/>
           <w:highlight w:val="yellow"/>
         </w:rPr>
-        <w:t>In sheep, the heritability of daily methane matched PAC estimates in New Zealand lambs and ewes (0.19–0.20) {Jonker, 2018 #99} and was lower than the respiration-chamber estimate of 0.29 {Pinares-Patiño, 2013 #67}. In cattle, daily methane heritability measures range from 0.15 to 0.42 in beef {Ryan, 2025 #146; Crowley, 2026 #169} and from 0.16 to 0.35 in dairy {de Haas, 2011; Kamalanathan, 2023}, with the highest beef estimates from full-test GreenFeed averages {Ryan, 2025 #146; Crowley, 2026 #169}, consistent with a single short PAC measurement capturing less of an animal's average emission {O'Connor, 2021 #23; Robinson, 2015}. The heritability of CH₄ ratio fell within the range of 0.17–0.25 reported by Jonker et al. {Jonker, 2018 #99}. Methane relative to product (0.21–0.66) and residual methane (0.38–0.46) were generally more heritable in cattle {Crowley, 2026 #169; de Haas, 2011; Kamalanathan, 2023} than the corresponding traits here, which adjust for body size, growth and CO₂ as proxies for intake rather than for measured intake or output.</w:t>
+        <w:t xml:space="preserve">In sheep, the heritability of daily methane matched PAC estimates in New Zealand lambs and ewes (0.19–0.20) {Jonker, 2018 #99} and was lower than the respiration-chamber estimate of 0.29 {Pinares-Patiño, 2013 #67}. In cattle, daily methane heritability measures range from 0.15 to 0.42 in beef {Ryan, 2025 #146; Crowley, 2026 #169} and from </w:t>
+      </w:r>
+      <w:r>
+        <w:rPr>
+          <w:b w:val="0"/>
+          <w:i w:val="0"/>
+          <w:highlight w:val="green"/>
+        </w:rPr>
+        <w:t>0.16 to 0.33 in dairy {van Breukelen, 2023 #171; Kamalanathan, 2023}</w:t>
+      </w:r>
+      <w:r>
+        <w:rPr>
+          <w:b w:val="0"/>
+          <w:i w:val="0"/>
+          <w:highlight w:val="yellow"/>
+        </w:rPr>
+        <w:t xml:space="preserve">, with the highest beef estimates from full-test GreenFeed averages {Ryan, 2025 #146; Crowley, 2026 #169}, consistent with a single short PAC measurement capturing less of an animal's average emission {O'Connor, 2021 #23; Robinson, 2015}. The heritability of CH₄ ratio fell within the range of 0.17–0.25 reported by Jonker et al. {Jonker, 2018 #99}. Methane relative to product (0.21–0.66) and residual methane (0.38–0.46) were generally more heritable in cattle </w:t>
+      </w:r>
+      <w:r>
+        <w:rPr>
+          <w:b w:val="0"/>
+          <w:i w:val="0"/>
+          <w:highlight w:val="green"/>
+        </w:rPr>
+        <w:t>{Crowley, 2026 #169; Kamalanathan, 2023}</w:t>
+      </w:r>
+      <w:r>
+        <w:rPr>
+          <w:b w:val="0"/>
+          <w:i w:val="0"/>
+          <w:highlight w:val="yellow"/>
+        </w:rPr>
+        <w:t xml:space="preserve"> than the corresponding traits here, which adjust for body size, growth and CO₂ as proxies for intake rather than for measured intake or output.</w:t>
       </w:r>
     </w:p>
     <w:p>
@@ -8359,7 +8545,23 @@
           <w:i w:val="0"/>
           <w:highlight w:val="yellow"/>
         </w:rPr>
-        <w:t>Carbon dioxide production was moderately heritable (h² = 0.25) and strongly genetically correlated with both daily methane (rg = 0.57 ± 0.04) and metabolic body weight (rg = 0.83 ± 0.02). CO₂ output reflects total heat production and hence energy intake, and PAC-measured CO₂ is strongly correlated with feed intake in sheep {Robinson, 2016; Paganoni, 2017} and cattle {Huhtanen, 2021; Arthur, 2018}. This makes it a useful, routinely recordable proxy for intake in grazing animals, which is why it was included in the selection index, although more efficient animals produce less CO₂ per unit of intake {Huhtanen, 2020}.</w:t>
+        <w:t xml:space="preserve">Carbon dioxide production was moderately heritable (h² = 0.25) and strongly genetically correlated with both daily methane (rg = 0.57 ± 0.04) and metabolic body weight (rg = 0.83 ± 0.02). CO₂ output reflects total heat production and hence energy intake, and CO₂ </w:t>
+      </w:r>
+      <w:r>
+        <w:rPr>
+          <w:b w:val="0"/>
+          <w:i w:val="0"/>
+          <w:highlight w:val="green"/>
+        </w:rPr>
+        <w:t>is strongly correlated with feed intake in PAC-measured sheep {Robinson, 2016; Paganoni, 2017} and in cattle {Huhtanen, 2021; Arthur, 2018}</w:t>
+      </w:r>
+      <w:r>
+        <w:rPr>
+          <w:b w:val="0"/>
+          <w:i w:val="0"/>
+          <w:highlight w:val="yellow"/>
+        </w:rPr>
+        <w:t>. This makes it a useful, routinely recordable proxy for intake in grazing animals, which is why it was included in the selection index, although more efficient animals produce less CO₂ per unit of intake {Huhtanen, 2020}.</w:t>
       </w:r>
     </w:p>
     <w:p>
@@ -8372,7 +8574,23 @@
           <w:i w:val="0"/>
           <w:highlight w:val="yellow"/>
         </w:rPr>
-        <w:t>Genetic evaluations can assume a common residual variance across contemporary groups. This assumption is rarely met, and when it is violated, records from more variable groups receive too much weight and variance components and breeding values are biased {Van Vleck, 1987; Cardoso, 2005}. It is particularly relevant to PAC methane: between-day and between-group variation in PAC measurements is large {O'Connor, 2021 #23}, emissions differ with site, pasture and protocol {Goopy, 2016; Robinson, 2015}, and the present data combined animals of very different ages and physiological stages. Classes based on contemporary-group mean methane within flock capture both sources, because mean methane differs strongly with age and stage. Accounting for this heterogeneity lowered the heritability of methane, CH₄/MBW, RMTMBW and RMTMBW+CO₂, and of CO₂, relative to a single pooled residual variance, so the heterogeneous-residual estimates are reported in Table 2 for these traits and for CH₄ ratio. Genetic correlations were little affected: the methane–methane intensity correlation was 0.85 in the full data and in young and mature animals separately, and the young-versus-mature genetic correlation for methane was 0.99. Residual heterogeneity therefore mainly affects heritability estimates rather than the genetic relationships in Tables 3–5, and should be accounted for whenever genetic parameters are estimated from PAC methane recorded across flocks and physiological stages.</w:t>
+        <w:t xml:space="preserve">Genetic evaluations can assume a common residual variance across contemporary groups. This assumption is rarely met, and when it is violated, records from more variable groups receive too much weight and variance components and breeding values are biased </w:t>
+      </w:r>
+      <w:r>
+        <w:rPr>
+          <w:b w:val="0"/>
+          <w:i w:val="0"/>
+          <w:highlight w:val="green"/>
+        </w:rPr>
+        <w:t>{Meuwissen, 1996; Van Vleck, 1987; Cardoso, 2005}</w:t>
+      </w:r>
+      <w:r>
+        <w:rPr>
+          <w:b w:val="0"/>
+          <w:i w:val="0"/>
+          <w:highlight w:val="yellow"/>
+        </w:rPr>
+        <w:t>. It is particularly relevant to PAC methane: between-day and between-group variation in PAC measurements is large {O'Connor, 2021 #23}, emissions differ with site, pasture and protocol {Goopy, 2016; Robinson, 2015}, and the present data combined animals of very different ages and physiological stages. Classes based on contemporary-group mean methane within flock capture both sources, because mean methane differs strongly with age and stage. Accounting for this heterogeneity lowered the heritability of methane, CH₄/MBW, RMTMBW and RMTMBW+CO₂, and of CO₂, relative to a single pooled residual variance, so the heterogeneous-residual estimates are reported in Table 2 for these traits and for CH₄ ratio. Genetic correlations were little affected: the methane–methane intensity correlation was 0.85 in the full data and in young and mature animals separately, and the young-versus-mature genetic correlation for methane was 0.99. Residual heterogeneity therefore mainly affects heritability estimates rather than the genetic relationships in Tables 3–5, and should be accounted for whenever genetic parameters are estimated from PAC methane recorded across flocks and physiological stages.</w:t>
       </w:r>
     </w:p>
     <w:p>
@@ -8392,7 +8610,23 @@
           <w:i w:val="0"/>
           <w:highlight w:val="yellow"/>
         </w:rPr>
-        <w:t>A ratio or residual trait is, in effect, a fixed weighting of methane against its denominator or adjustment trait {Kennedy, 1993 #92}. It is therefore the weighting of methane, body size and CO₂ in the breeding goal, not the methane trait definition, that determines whether methane can be reduced without reducing size.</w:t>
+        <w:t xml:space="preserve">A ratio or residual trait is, in effect, a fixed weighting of methane against its denominator or adjustment trait </w:t>
+      </w:r>
+      <w:r>
+        <w:rPr>
+          <w:b w:val="0"/>
+          <w:i w:val="0"/>
+          <w:highlight w:val="green"/>
+        </w:rPr>
+        <w:t>{Kennedy, 1993 #92; Gunsett, 1984}</w:t>
+      </w:r>
+      <w:r>
+        <w:rPr>
+          <w:b w:val="0"/>
+          <w:i w:val="0"/>
+          <w:highlight w:val="yellow"/>
+        </w:rPr>
+        <w:t>. It is therefore the weighting of methane, body size and CO₂ in the breeding goal, not the methane trait definition, that determines whether methane can be reduced without reducing size.</w:t>
       </w:r>
     </w:p>
     <w:p>

</xml_diff>

<commit_message>
Cite only Robinson 2016 for CO2 as an intake proxy
Checked against the PDF: Robinson 2020 reports methane-intake correlations
but nothing on CO2, so it no longer supports the three CO2-as-intake-proxy
sentences. Also records that the beef heritability ranges and the Levrault
repeatability figure match their sources.

Co-Authored-By: Claude Opus 5.5 <noreply@anthropic.com>
Claude-Session: https://claude.ai/code/session_011pcAjTufrABAdJ2Ewj7SR3
</commit_message>
<xml_diff>
--- a/manuscript/revised/Methane_manuscript_draft7_EndNote.docx
+++ b/manuscript/revised/Methane_manuscript_draft7_EndNote.docx
@@ -286,7 +286,23 @@
           <w:i w:val="0"/>
           <w:highlight w:val="yellow"/>
         </w:rPr>
-        <w:t xml:space="preserve">Portable accumulation chambers are portable and low-cost, allowing groups of animals to be measured in about an hour under field conditions {Goopy, 2016; Robinson, 2015}. Methane measurements from PACs have been shown to be heritable (0.13–0.20 in grazing sheep) {Jonker, 2018 #99; Goopy, 2016; Wahinya, 2022} and genetically correlated with respiration chamber (RC) methane (rg = 0.62–1.00) {Jonker, 2018 #99; Robinson, 2020}. PACs also record carbon dioxide (CO₂), which is correlated with feed intake and so offers a proxy for intake in grazing animals, where it cannot be measured directly {Robinson, 2016; Robinson, 2020}. Although PACs provide a short spot measurement taken after feed withdrawal, and so show lower repeatability than RCs </w:t>
+        <w:t xml:space="preserve">Portable accumulation chambers are portable and low-cost, allowing groups of animals to be measured in about an hour under field conditions {Goopy, 2016; Robinson, 2015}. Methane measurements from PACs have been shown to be heritable (0.13–0.20 in grazing sheep) {Jonker, 2018 #99; Goopy, 2016; Wahinya, 2022} and genetically correlated with respiration chamber (RC) methane (rg = 0.62–1.00) {Jonker, 2018 #99; Robinson, 2020}. PACs also record carbon dioxide (CO₂), which is correlated with feed intake and so offers a proxy for intake in grazing animals, where it cannot be measured directly </w:t>
+      </w:r>
+      <w:r>
+        <w:rPr>
+          <w:b w:val="0"/>
+          <w:i w:val="0"/>
+          <w:highlight w:val="green"/>
+        </w:rPr>
+        <w:t>{Robinson, 2016}</w:t>
+      </w:r>
+      <w:r>
+        <w:rPr>
+          <w:b w:val="0"/>
+          <w:i w:val="0"/>
+          <w:highlight w:val="yellow"/>
+        </w:rPr>
+        <w:t xml:space="preserve">. Although PACs provide a short spot measurement taken after feed withdrawal, and so show lower repeatability than RCs </w:t>
       </w:r>
       <w:r>
         <w:rPr>
@@ -1542,7 +1558,23 @@
           <w:i w:val="0"/>
           <w:highlight w:val="yellow"/>
         </w:rPr>
-        <w:t>To investigate how methane traits respond to selection, an index was built around traits that are widely recorded and of central importance: MBW, an important measure of body size that underlies several traits in sheep breeding indexes, and CO₂, which is recorded alongside CH₄ at every PAC measurement and serves as a proxy for feed intake {Robinson, 2016; Robinson, 2020}. The selection index analysis examined how absolute, ratio and residual methane traits themselves operate within an index. The aim was to understand the behaviour of these traits, not to estimate the response to selection under a national breeding index.</w:t>
+        <w:t xml:space="preserve">To investigate how methane traits respond to selection, an index was built around traits that are widely recorded and of central importance: MBW, an important measure of body size that underlies several traits in sheep breeding indexes, and CO₂, which is recorded alongside CH₄ at every PAC measurement and serves as a proxy for feed intake </w:t>
+      </w:r>
+      <w:r>
+        <w:rPr>
+          <w:b w:val="0"/>
+          <w:i w:val="0"/>
+          <w:highlight w:val="green"/>
+        </w:rPr>
+        <w:t>{Robinson, 2016}</w:t>
+      </w:r>
+      <w:r>
+        <w:rPr>
+          <w:b w:val="0"/>
+          <w:i w:val="0"/>
+          <w:highlight w:val="yellow"/>
+        </w:rPr>
+        <w:t>. The selection index analysis examined how absolute, ratio and residual methane traits themselves operate within an index. The aim was to understand the behaviour of these traits, not to estimate the response to selection under a national breeding index.</w:t>
       </w:r>
     </w:p>
     <w:p>
@@ -8454,7 +8486,23 @@
           <w:i w:val="0"/>
           <w:highlight w:val="yellow"/>
         </w:rPr>
-        <w:t>. The adjustment traits used here are also biologically relevant in their own right. Maintenance energy requirements, and hence much of an animal's feed intake, scale with metabolic body weight, so MBW captures the size-driven component of intake. Average daily gain and muscle mass describe the rate and product of growth, so methane expressed relative to them approximates emissions per unit of output. Rumen volume reflects fermentative capacity and retention time {Goopy, 2014}. Carbon dioxide output reflects total metabolic activity and is closely related to feed intake in PAC-measured sheep {Robinson, 2016; Robinson, 2020}, so CH₄ ratio and RMTMBW+CO₂ approximate methane relative to intake. The results presented here show both the value and the limits of that approach.</w:t>
+        <w:t xml:space="preserve">. The adjustment traits used here are also biologically relevant in their own right. Maintenance energy requirements, and hence much of an animal's feed intake, scale with metabolic body weight, so MBW captures the size-driven component of intake. Average daily gain and muscle mass describe the rate and product of growth, so methane expressed relative to them approximates emissions per unit of output. Rumen volume reflects fermentative capacity and retention time {Goopy, 2014}. Carbon dioxide output reflects total metabolic activity and is closely related to feed intake in PAC-measured sheep </w:t>
+      </w:r>
+      <w:r>
+        <w:rPr>
+          <w:b w:val="0"/>
+          <w:i w:val="0"/>
+          <w:highlight w:val="green"/>
+        </w:rPr>
+        <w:t>{Robinson, 2016}</w:t>
+      </w:r>
+      <w:r>
+        <w:rPr>
+          <w:b w:val="0"/>
+          <w:i w:val="0"/>
+          <w:highlight w:val="yellow"/>
+        </w:rPr>
+        <w:t>, so CH₄ ratio and RMTMBW+CO₂ approximate methane relative to intake. The results presented here show both the value and the limits of that approach.</w:t>
       </w:r>
     </w:p>
     <w:p>

</xml_diff>